<commit_message>
Team 6 - Structure Charts and DFD for Resume Service - Submission and Storage COMPLETED for Team QA
</commit_message>
<xml_diff>
--- a/03_Team_Work/Team6/Milestone_3_Components/ST_M3_Team6_StructureCharts-ResumeService-SubmissionAndStorage_v01.docx
+++ b/03_Team_Work/Team6/Milestone_3_Components/ST_M3_Team6_StructureCharts-ResumeService-SubmissionAndStorage_v01.docx
@@ -12,15 +12,7 @@
           <w:b/>
           <w:color w:val="000000"/>
         </w:rPr>
-        <w:t xml:space="preserve">Structure Charts — </w:t>
-      </w:r>
-      <w:r>
-        <w:rPr>
-          <w:rFonts w:ascii="Arial" w:eastAsia="Arial" w:hAnsi="Arial" w:cs="Arial"/>
-          <w:b/>
-          <w:color w:val="000000"/>
-        </w:rPr>
-        <w:t>Resume Service</w:t>
+        <w:t>Structure Charts — Resume Service</w:t>
       </w:r>
     </w:p>
     <w:p>
@@ -38,39 +30,7 @@
           <w:b/>
           <w:color w:val="000000"/>
         </w:rPr>
-        <w:t>SC Figure 1.</w:t>
-      </w:r>
-      <w:r>
-        <w:rPr>
-          <w:rFonts w:ascii="Arial" w:eastAsia="Arial" w:hAnsi="Arial" w:cs="Arial"/>
-          <w:b/>
-          <w:color w:val="000000"/>
-        </w:rPr>
-        <w:t>7</w:t>
-      </w:r>
-      <w:r>
-        <w:rPr>
-          <w:rFonts w:ascii="Arial" w:eastAsia="Arial" w:hAnsi="Arial" w:cs="Arial"/>
-          <w:b/>
-          <w:color w:val="000000"/>
-        </w:rPr>
-        <w:t>.0.</w:t>
-      </w:r>
-      <w:r>
-        <w:rPr>
-          <w:rFonts w:ascii="Arial" w:eastAsia="Arial" w:hAnsi="Arial" w:cs="Arial"/>
-          <w:b/>
-          <w:color w:val="000000"/>
-        </w:rPr>
-        <w:t>3</w:t>
-      </w:r>
-      <w:r>
-        <w:rPr>
-          <w:rFonts w:ascii="Arial" w:eastAsia="Arial" w:hAnsi="Arial" w:cs="Arial"/>
-          <w:b/>
-          <w:color w:val="000000"/>
-        </w:rPr>
-        <w:t xml:space="preserve"> — </w:t>
+        <w:t xml:space="preserve">SC Figure 1.7.0.3 — </w:t>
       </w:r>
       <w:proofErr w:type="spellStart"/>
       <w:proofErr w:type="gramStart"/>
@@ -112,16 +72,50 @@
       </w:pPr>
       <w:r>
         <w:rPr>
-          <w:rFonts w:ascii="Arial" w:eastAsia="Arial" w:hAnsi="Arial" w:cs="Arial"/>
-          <w:color w:val="000000"/>
+          <w:noProof/>
         </w:rPr>
-        <w:t xml:space="preserve">[new chart] </w:t>
+        <w:drawing>
+          <wp:inline distT="0" distB="0" distL="0" distR="0" wp14:anchorId="3A5767AE" wp14:editId="6472FD78">
+            <wp:extent cx="5943600" cy="3608070"/>
+            <wp:effectExtent l="0" t="0" r="0" b="0"/>
+            <wp:docPr id="1975381823" name="Picture 1"/>
+            <wp:cNvGraphicFramePr>
+              <a:graphicFrameLocks xmlns:a="http://schemas.openxmlformats.org/drawingml/2006/main" noChangeAspect="1"/>
+            </wp:cNvGraphicFramePr>
+            <a:graphic xmlns:a="http://schemas.openxmlformats.org/drawingml/2006/main">
+              <a:graphicData uri="http://schemas.openxmlformats.org/drawingml/2006/picture">
+                <pic:pic xmlns:pic="http://schemas.openxmlformats.org/drawingml/2006/picture">
+                  <pic:nvPicPr>
+                    <pic:cNvPr id="1975381823" name="Picture 1975381823"/>
+                    <pic:cNvPicPr/>
+                  </pic:nvPicPr>
+                  <pic:blipFill>
+                    <a:blip r:embed="rId4" cstate="print">
+                      <a:extLst>
+                        <a:ext uri="{28A0092B-C50C-407E-A947-70E740481C1C}">
+                          <a14:useLocalDpi xmlns:a14="http://schemas.microsoft.com/office/drawing/2010/main" val="0"/>
+                        </a:ext>
+                      </a:extLst>
+                    </a:blip>
+                    <a:stretch>
+                      <a:fillRect/>
+                    </a:stretch>
+                  </pic:blipFill>
+                  <pic:spPr>
+                    <a:xfrm>
+                      <a:off x="0" y="0"/>
+                      <a:ext cx="5943600" cy="3608070"/>
+                    </a:xfrm>
+                    <a:prstGeom prst="rect">
+                      <a:avLst/>
+                    </a:prstGeom>
+                  </pic:spPr>
+                </pic:pic>
+              </a:graphicData>
+            </a:graphic>
+          </wp:inline>
+        </w:drawing>
       </w:r>
-    </w:p>
-    <w:p>
-      <w:pPr>
-        <w:contextualSpacing/>
-      </w:pPr>
     </w:p>
     <w:p>
       <w:pPr>
@@ -133,39 +127,7 @@
           <w:b/>
           <w:color w:val="000000"/>
         </w:rPr>
-        <w:t>SC Figure 1.</w:t>
-      </w:r>
-      <w:r>
-        <w:rPr>
-          <w:rFonts w:ascii="Arial" w:eastAsia="Arial" w:hAnsi="Arial" w:cs="Arial"/>
-          <w:b/>
-          <w:color w:val="000000"/>
-        </w:rPr>
-        <w:t>7</w:t>
-      </w:r>
-      <w:r>
-        <w:rPr>
-          <w:rFonts w:ascii="Arial" w:eastAsia="Arial" w:hAnsi="Arial" w:cs="Arial"/>
-          <w:b/>
-          <w:color w:val="000000"/>
-        </w:rPr>
-        <w:t>.0.</w:t>
-      </w:r>
-      <w:r>
-        <w:rPr>
-          <w:rFonts w:ascii="Arial" w:eastAsia="Arial" w:hAnsi="Arial" w:cs="Arial"/>
-          <w:b/>
-          <w:color w:val="000000"/>
-        </w:rPr>
-        <w:t>4</w:t>
-      </w:r>
-      <w:r>
-        <w:rPr>
-          <w:rFonts w:ascii="Arial" w:eastAsia="Arial" w:hAnsi="Arial" w:cs="Arial"/>
-          <w:b/>
-          <w:color w:val="000000"/>
-        </w:rPr>
-        <w:t xml:space="preserve"> — </w:t>
+        <w:t xml:space="preserve">SC Figure 1.7.0.4 — </w:t>
       </w:r>
       <w:proofErr w:type="spellStart"/>
       <w:proofErr w:type="gramStart"/>
@@ -175,7 +137,15 @@
           <w:b/>
           <w:color w:val="000000"/>
         </w:rPr>
-        <w:t>validateResume</w:t>
+        <w:t>check</w:t>
+      </w:r>
+      <w:r>
+        <w:rPr>
+          <w:rFonts w:ascii="Arial" w:eastAsia="Arial" w:hAnsi="Arial" w:cs="Arial"/>
+          <w:b/>
+          <w:color w:val="000000"/>
+        </w:rPr>
+        <w:t>Resume</w:t>
       </w:r>
       <w:proofErr w:type="spellEnd"/>
       <w:r>
@@ -207,89 +177,49 @@
       </w:pPr>
       <w:r>
         <w:rPr>
-          <w:rFonts w:ascii="Arial" w:eastAsia="Arial" w:hAnsi="Arial" w:cs="Arial"/>
-          <w:color w:val="000000"/>
+          <w:noProof/>
         </w:rPr>
-        <w:t xml:space="preserve">[new chart] </w:t>
-      </w:r>
-    </w:p>
-    <w:p>
-      <w:pPr>
-        <w:contextualSpacing/>
-      </w:pPr>
-    </w:p>
-    <w:p>
-      <w:pPr>
-        <w:contextualSpacing/>
-      </w:pPr>
-      <w:r>
-        <w:rPr>
-          <w:rFonts w:ascii="Arial" w:eastAsia="Arial" w:hAnsi="Arial" w:cs="Arial"/>
-          <w:b/>
-          <w:color w:val="000000"/>
-        </w:rPr>
-        <w:t>SC Figure 1.7.0.</w:t>
-      </w:r>
-      <w:r>
-        <w:rPr>
-          <w:rFonts w:ascii="Arial" w:eastAsia="Arial" w:hAnsi="Arial" w:cs="Arial"/>
-          <w:b/>
-          <w:color w:val="000000"/>
-        </w:rPr>
-        <w:t>5</w:t>
-      </w:r>
-      <w:r>
-        <w:rPr>
-          <w:rFonts w:ascii="Arial" w:eastAsia="Arial" w:hAnsi="Arial" w:cs="Arial"/>
-          <w:b/>
-          <w:color w:val="000000"/>
-        </w:rPr>
-        <w:t xml:space="preserve"> — </w:t>
-      </w:r>
-      <w:proofErr w:type="spellStart"/>
-      <w:proofErr w:type="gramStart"/>
-      <w:r>
-        <w:rPr>
-          <w:rFonts w:ascii="Arial" w:eastAsia="Arial" w:hAnsi="Arial" w:cs="Arial"/>
-          <w:b/>
-          <w:color w:val="000000"/>
-        </w:rPr>
-        <w:t>viewResume</w:t>
-      </w:r>
-      <w:proofErr w:type="spellEnd"/>
-      <w:r>
-        <w:rPr>
-          <w:rFonts w:ascii="Arial" w:eastAsia="Arial" w:hAnsi="Arial" w:cs="Arial"/>
-          <w:b/>
-          <w:color w:val="000000"/>
-        </w:rPr>
-        <w:t>(</w:t>
-      </w:r>
-      <w:proofErr w:type="gramEnd"/>
-      <w:r>
-        <w:rPr>
-          <w:rFonts w:ascii="Arial" w:eastAsia="Arial" w:hAnsi="Arial" w:cs="Arial"/>
-          <w:b/>
-          <w:color w:val="000000"/>
-        </w:rPr>
-        <w:t xml:space="preserve">) </w:t>
-      </w:r>
-    </w:p>
-    <w:p>
-      <w:pPr>
-        <w:contextualSpacing/>
-      </w:pPr>
-    </w:p>
-    <w:p>
-      <w:pPr>
-        <w:contextualSpacing/>
-      </w:pPr>
-      <w:r>
-        <w:rPr>
-          <w:rFonts w:ascii="Arial" w:eastAsia="Arial" w:hAnsi="Arial" w:cs="Arial"/>
-          <w:color w:val="000000"/>
-        </w:rPr>
-        <w:t xml:space="preserve">[new chart] </w:t>
+        <w:drawing>
+          <wp:inline distT="0" distB="0" distL="0" distR="0" wp14:anchorId="12306B28" wp14:editId="432B0531">
+            <wp:extent cx="5943600" cy="3257550"/>
+            <wp:effectExtent l="0" t="0" r="0" b="0"/>
+            <wp:docPr id="1589212951" name="Picture 2"/>
+            <wp:cNvGraphicFramePr>
+              <a:graphicFrameLocks xmlns:a="http://schemas.openxmlformats.org/drawingml/2006/main" noChangeAspect="1"/>
+            </wp:cNvGraphicFramePr>
+            <a:graphic xmlns:a="http://schemas.openxmlformats.org/drawingml/2006/main">
+              <a:graphicData uri="http://schemas.openxmlformats.org/drawingml/2006/picture">
+                <pic:pic xmlns:pic="http://schemas.openxmlformats.org/drawingml/2006/picture">
+                  <pic:nvPicPr>
+                    <pic:cNvPr id="1589212951" name="Picture 1589212951"/>
+                    <pic:cNvPicPr/>
+                  </pic:nvPicPr>
+                  <pic:blipFill>
+                    <a:blip r:embed="rId5" cstate="print">
+                      <a:extLst>
+                        <a:ext uri="{28A0092B-C50C-407E-A947-70E740481C1C}">
+                          <a14:useLocalDpi xmlns:a14="http://schemas.microsoft.com/office/drawing/2010/main" val="0"/>
+                        </a:ext>
+                      </a:extLst>
+                    </a:blip>
+                    <a:stretch>
+                      <a:fillRect/>
+                    </a:stretch>
+                  </pic:blipFill>
+                  <pic:spPr>
+                    <a:xfrm>
+                      <a:off x="0" y="0"/>
+                      <a:ext cx="5943600" cy="3257550"/>
+                    </a:xfrm>
+                    <a:prstGeom prst="rect">
+                      <a:avLst/>
+                    </a:prstGeom>
+                  </pic:spPr>
+                </pic:pic>
+              </a:graphicData>
+            </a:graphic>
+          </wp:inline>
+        </w:drawing>
       </w:r>
     </w:p>
     <w:p/>

</xml_diff>